<commit_message>
Modelos Word: sem marca-texto, contrato sem empresa, procuracao sem (a)(a)
</commit_message>
<xml_diff>
--- a/templates/TEMPLATE_CONTRATO_DE_HONORARIOS.docx
+++ b/templates/TEMPLATE_CONTRATO_DE_HONORARIOS.docx
@@ -67,16 +67,14 @@
           <w:rFonts w:ascii="Times New Roman" w:eastAsia="Times New Roman" w:hAnsi="Times New Roman" w:cs="Times New Roman"/>
           <w:b/>
           <w:bCs/>
-          <w:highlight w:val="yellow"/>
         </w:rPr>
         <w:t xml:space="preserve">{{nomeCliente}}, </w:t>
       </w:r>
       <w:r>
         <w:rPr>
           <w:rFonts w:ascii="Times New Roman" w:eastAsia="Times New Roman" w:hAnsi="Times New Roman" w:cs="Times New Roman"/>
-          <w:highlight w:val="yellow"/>
-        </w:rPr>
-        <w:t>{{nacionalidade}}, {{estadoCivil}}, {{profissao}}, portador(a) da cédula de identidade nº {{rg}}, e inscrito(a) no CPF nº {{cpf}}, residente e domiciliado no(a) {{endereco}}, CEP: {{cep}}</w:t>
+        </w:rPr>
+        <w:t xml:space="preserve">{{nacionalidade}}, {{estadoCivil}}, {{profissao}}, portador(a) da cédula de identidade nº {{rg}}, e inscrito(a) no CPF nº {{cpf}}, residente e domiciliado(a) em {{endereco}}, CEP: {{cep}}</w:t>
       </w:r>
       <w:r>
         <w:rPr>
@@ -161,7 +159,7 @@
         <w:rPr>
           <w:rFonts w:ascii="Times New Roman" w:eastAsia="Times New Roman" w:hAnsi="Times New Roman" w:cs="Times New Roman"/>
         </w:rPr>
-        <w:t xml:space="preserve">O CONTRATADO, face ao Mandato Judicial, se obriga a defender os interesses do(a) CONTRATANTE, para dar-lhe assistência jurídica com o fim específico de propor Reclamação Trabalhista em face de {{nomeEmpresa}} com o objetivo de pleitear seus direitos, acompanhando o feito até decisão de primeiro grau, desempenhando com zelo o mandato judicial ora assumido. </w:t>
+        <w:t xml:space="preserve">O CONTRATADO, face ao Mandato Judicial, se obriga a defender os interesses do(a) CONTRATANTE, para dar-lhe assistência jurídica com o fim específico de propor Reclamação Trabalhista com o objetivo de pleitear seus direitos, acompanhando o feito até decisão de primeiro grau, desempenhando com zelo o mandato judicial ora assumido. </w:t>
       </w:r>
       <w:r>
         <w:rPr>
@@ -300,7 +298,7 @@
         <w:rPr>
           <w:rFonts w:ascii="Times New Roman" w:eastAsia="Times New Roman" w:hAnsi="Times New Roman" w:cs="Times New Roman"/>
         </w:rPr>
-        <w:t xml:space="preserve"> do que (o)a CONTRATANTE vier a receber ao final da Reclamação Trabalhista proposta, seja em acordo judicial ou extrajudicial, execução, FGTS ou em qualquer valor a ser apurado na sentença ou na execução, a serem pagos assim que a finalidade do(a) CONTRATANTE for atingida, estando desde já autorizado que o CONTRATADO efetue o desconto da verba honorária advocatícia ora ajustada, seja na hipótese de pagamento feito direto a esse ou por meio de levantamento por guia ou alvará judicial, com repasse do saldo remanescente ao(à) CONTRATANTE. Em caso de desistência por parte do(a) CONTRATANTE após a assinatura do presente contrato, este deverá pagar o valor total dos honorários ajustados</w:t>
+        <w:t xml:space="preserve"> do que o(a) CONTRATANTE vier a receber ao final da Reclamação Trabalhista proposta, seja em acordo judicial ou extrajudicial, execução, FGTS ou em qualquer valor a ser apurado na sentença ou na execução, a serem pagos assim que a finalidade do(a) CONTRATANTE for atingida, estando desde já autorizado que o CONTRATADO efetue o desconto da verba honorária advocatícia ora ajustada, seja na hipótese de pagamento feito direto a esse ou por meio de levantamento por guia ou alvará judicial, com repasse do saldo remanescente ao(à) CONTRATANTE. Em caso de desistência por parte do(a) CONTRATANTE após a assinatura do presente contrato, este(a) deverá pagar o valor total dos honorários ajustados</w:t>
       </w:r>
       <w:r>
         <w:rPr>
@@ -869,7 +867,7 @@
         <w:rPr>
           <w:rFonts w:ascii="Times New Roman" w:eastAsia="Times New Roman" w:hAnsi="Times New Roman" w:cs="Times New Roman"/>
         </w:rPr>
-        <w:t xml:space="preserve"> - Na hipótese de desistência ou arquivamento da Reclamação Trabalhista patrocinada pelo Contratado, e sua consequente distribuição por outro procurador diverso daqueles constantes da procuração outorgada pela Contratante no ato da assinatura do presente instrumento; </w:t>
+        <w:t xml:space="preserve"> - Na hipótese de desistência ou arquivamento da Reclamação Trabalhista patrocinada pelo Contratado, e sua consequente distribuição por outro procurador diverso daqueles constantes da procuração outorgada pelo(a) Contratante no ato da assinatura do presente instrumento; </w:t>
       </w:r>
       <w:r>
         <w:rPr>
@@ -939,7 +937,7 @@
         <w:rPr>
           <w:rFonts w:ascii="Times New Roman" w:eastAsia="Times New Roman" w:hAnsi="Times New Roman" w:cs="Times New Roman"/>
         </w:rPr>
-        <w:t xml:space="preserve"> - O(A) Contratante está ciente de que os honorários estipulados no presente contrato são sobre o benefício econômico da ação supracitada a ser ajuizada, a se realizar mediante depósito bancário em conta a ser informada pelo Contratado, ou mediante outro meio ajustado pelas partes, seja em acordo judicial ou extrajudicial, execução, FGTS ou em qualquer valor a ser apurado na sentença ou na execução, estando desde já autorizado que o Contratado efetue o desconto da verba honorária advocatícia ora ajustada, seja na hipótese de pagamento feito direto a esse ou por meio de levantamento por guia ou alvará judicial, com repasse do saldo remanescente ao(à) Contratante. Em caso de desistência por parte do(a) Contratante após a assinatura do presente contrato, este deverá pagar o valor total dos honorários ajustados e apurados. </w:t>
+        <w:t xml:space="preserve"> - O(A) Contratante está ciente de que os honorários estipulados no presente contrato são sobre o benefício econômico da ação supracitada a ser ajuizada, a se realizar mediante depósito bancário em conta a ser informada pelo Contratado, ou mediante outro meio ajustado pelas partes, seja em acordo judicial ou extrajudicial, execução, FGTS ou em qualquer valor a ser apurado na sentença ou na execução, estando desde já autorizado que o Contratado efetue o desconto da verba honorária advocatícia ora ajustada, seja na hipótese de pagamento feito direto a esse ou por meio de levantamento por guia ou alvará judicial, com repasse do saldo remanescente ao(à) Contratante. Em caso de desistência por parte do(a) Contratante após a assinatura do presente contrato, este(a) deverá pagar o valor total dos honorários ajustados e apurados. </w:t>
       </w:r>
       <w:r>
         <w:rPr>
@@ -1388,7 +1386,6 @@
       <w:r>
         <w:rPr>
           <w:rFonts w:ascii="Times New Roman" w:eastAsia="Times New Roman" w:hAnsi="Times New Roman" w:cs="Times New Roman"/>
-          <w:highlight w:val="yellow"/>
         </w:rPr>
         <w:t>{{dataExtenso}}</w:t>
       </w:r>

</xml_diff>